<commit_message>
fix(livrables): corrections après vérification croisée code↔docs
- L4 : email maintenant documenté comme modifiable (tableau + initState)
- L5 : taille APK corrigée 54.2MB → 57.9MB (4 occurrences + bilan)
- L6 : légende screenshot APK 54.2MB → 57.9MB
- Régénération des 6 docx
</commit_message>
<xml_diff>
--- a/livrables/docx/DIAPALER_AFRICA_Livrable4.docx
+++ b/livrables/docx/DIAPALER_AFRICA_Livrable4.docx
@@ -9638,6 +9638,21 @@
           <w:color w:val="1F2D3D"/>
           <w:sz w:val="18"/>
         </w:rPr>
+        <w:t xml:space="preserve">  _email     = TextEditingController(text: _initial.email);</w:t>
+      </w:r>
+    </w:p>
+    <w:p>
+      <w:pPr>
+        <w:spacing w:before="0" w:after="0"/>
+        <w:ind w:left="283"/>
+        <w:shd w:val="clear" w:color="auto" w:fill="F3F4F6"/>
+      </w:pPr>
+      <w:r>
+        <w:rPr>
+          <w:rFonts w:ascii="Courier New" w:hAnsi="Courier New"/>
+          <w:color w:val="1F2D3D"/>
+          <w:sz w:val="18"/>
+        </w:rPr>
         <w:t xml:space="preserve">  _phone     = TextEditingController(text: _initial.phone);</w:t>
       </w:r>
     </w:p>
@@ -15905,7 +15920,7 @@
                 <w:rFonts w:ascii="Calibri" w:hAnsi="Calibri"/>
                 <w:sz w:val="20"/>
               </w:rPr>
-              <w:t>Email affiché (non modifiable — identifiant Firebase)</w:t>
+              <w:t>Champ email modifiable, mis à jour dans Firebase et cache</w:t>
             </w:r>
           </w:p>
         </w:tc>

</xml_diff>